<commit_message>
Apply supplied HWP report cover and refresh final submission package
</commit_message>
<xml_diff>
--- a/projects/kdu-club/submission/02_report/project_report.docx
+++ b/projects/kdu-club/submission/02_report/project_report.docx
@@ -4,7 +4,407 @@
   <w:body>
     <w:p>
       <w:pPr>
+        <w:spacing w:before="0" w:after="1400" w:line="240" w:lineRule="auto"/>
+        <w:jc w:val="left"/>
+      </w:pPr>
+      <w:r>
+        <w:rPr>
+          <w:rFonts w:ascii="Noto Serif CJK KR" w:hAnsi="Noto Serif CJK KR" w:eastAsia="Noto Serif CJK KR"/>
+          <w:b/>
+          <w:color w:val="000000"/>
+          <w:sz w:val="40"/>
+        </w:rPr>
+        <w:t>2026학년도 2학기</w:t>
+      </w:r>
+    </w:p>
+    <w:p>
+      <w:pPr>
+        <w:spacing w:before="0" w:after="1000" w:line="240" w:lineRule="auto"/>
+        <w:jc w:val="center"/>
+      </w:pPr>
+      <w:r>
+        <w:rPr>
+          <w:rFonts w:ascii="Noto Serif CJK KR" w:hAnsi="Noto Serif CJK KR" w:eastAsia="Noto Serif CJK KR"/>
+          <w:b/>
+          <w:color w:val="000000"/>
+          <w:sz w:val="120"/>
+        </w:rPr>
+        <w:t>보 고 서</w:t>
+      </w:r>
+    </w:p>
+    <w:p>
+      <w:pPr>
+        <w:spacing w:before="0" w:after="240" w:line="240" w:lineRule="auto"/>
+        <w:jc w:val="center"/>
+      </w:pPr>
+      <w:r>
+        <w:rPr>
+          <w:rFonts w:ascii="Noto Serif CJK KR" w:hAnsi="Noto Serif CJK KR" w:eastAsia="Noto Serif CJK KR"/>
+          <w:b/>
+          <w:color w:val="000000"/>
+          <w:sz w:val="54"/>
+        </w:rPr>
+        <w:t>KDU 동아리 웹사이트</w:t>
+        <w:br/>
+        <w:t>설계 및 구현 보고서</w:t>
+      </w:r>
+    </w:p>
+    <w:p>
+      <w:pPr>
+        <w:spacing w:after="560"/>
+        <w:jc w:val="center"/>
+      </w:pPr>
+      <w:r>
+        <w:drawing>
+          <wp:inline xmlns:a="http://schemas.openxmlformats.org/drawingml/2006/main" xmlns:pic="http://schemas.openxmlformats.org/drawingml/2006/picture">
+            <wp:extent cx="997069" cy="1069848"/>
+            <wp:docPr id="8" name="Picture 8"/>
+            <wp:cNvGraphicFramePr>
+              <a:graphicFrameLocks noChangeAspect="1"/>
+            </wp:cNvGraphicFramePr>
+            <a:graphic>
+              <a:graphicData uri="http://schemas.openxmlformats.org/drawingml/2006/picture">
+                <pic:pic>
+                  <pic:nvPicPr>
+                    <pic:cNvPr id="0" name="kdu_logo.jpg"/>
+                    <pic:cNvPicPr/>
+                  </pic:nvPicPr>
+                  <pic:blipFill>
+                    <a:blip r:embed="rId18"/>
+                    <a:stretch>
+                      <a:fillRect/>
+                    </a:stretch>
+                  </pic:blipFill>
+                  <pic:spPr>
+                    <a:xfrm>
+                      <a:off x="0" y="0"/>
+                      <a:ext cx="997069" cy="1069848"/>
+                    </a:xfrm>
+                    <a:prstGeom prst="rect"/>
+                  </pic:spPr>
+                </pic:pic>
+              </a:graphicData>
+            </a:graphic>
+          </wp:inline>
+        </w:drawing>
+      </w:r>
+    </w:p>
+    <w:tbl>
+      <w:tblPr>
+        <w:tblW w:type="auto" w:w="0"/>
+        <w:jc w:val="center"/>
+        <w:tblLayout w:type="fixed"/>
+        <w:tblLook w:firstColumn="1" w:firstRow="1" w:lastColumn="0" w:lastRow="0" w:noHBand="0" w:noVBand="1" w:val="04A0"/>
+      </w:tblPr>
+      <w:tblGrid>
+        <w:gridCol w:w="4819"/>
+        <w:gridCol w:w="4819"/>
+      </w:tblGrid>
+      <w:tr>
+        <w:trPr>
+          <w:trHeight w:val="680"/>
+        </w:trPr>
+        <w:tc>
+          <w:tcPr>
+            <w:tcW w:type="dxa" w:w="4819"/>
+            <w:vAlign w:val="center"/>
+            <w:tcBorders>
+              <w:top w:val="single" w:sz="6" w:color="000000"/>
+              <w:left w:val="single" w:sz="6" w:color="000000"/>
+              <w:bottom w:val="single" w:sz="6" w:color="000000"/>
+              <w:right w:val="single" w:sz="6" w:color="000000"/>
+            </w:tcBorders>
+          </w:tcPr>
+          <w:p>
+            <w:pPr>
+              <w:spacing w:before="0" w:after="0" w:line="240" w:lineRule="auto"/>
+              <w:jc w:val="center"/>
+            </w:pPr>
+            <w:r>
+              <w:rPr>
+                <w:rFonts w:ascii="Noto Serif CJK KR" w:hAnsi="Noto Serif CJK KR" w:eastAsia="Noto Serif CJK KR"/>
+                <w:b/>
+                <w:sz w:val="26"/>
+              </w:rPr>
+              <w:t>과목명</w:t>
+            </w:r>
+          </w:p>
+        </w:tc>
+        <w:tc>
+          <w:tcPr>
+            <w:tcW w:type="dxa" w:w="4819"/>
+            <w:vAlign w:val="center"/>
+            <w:tcBorders>
+              <w:top w:val="single" w:sz="6" w:color="000000"/>
+              <w:left w:val="single" w:sz="6" w:color="000000"/>
+              <w:bottom w:val="single" w:sz="6" w:color="000000"/>
+              <w:right w:val="single" w:sz="6" w:color="000000"/>
+            </w:tcBorders>
+          </w:tcPr>
+          <w:p>
+            <w:pPr>
+              <w:spacing w:before="0" w:after="0" w:line="240" w:lineRule="auto"/>
+              <w:jc w:val="center"/>
+            </w:pPr>
+            <w:r>
+              <w:rPr>
+                <w:rFonts w:ascii="Noto Serif CJK KR" w:hAnsi="Noto Serif CJK KR" w:eastAsia="Noto Serif CJK KR"/>
+                <w:b w:val="0"/>
+                <w:sz w:val="26"/>
+              </w:rPr>
+              <w:t>소프트웨어개발</w:t>
+            </w:r>
+          </w:p>
+        </w:tc>
+      </w:tr>
+      <w:tr>
+        <w:trPr>
+          <w:trHeight w:val="680"/>
+        </w:trPr>
+        <w:tc>
+          <w:tcPr>
+            <w:tcW w:type="dxa" w:w="4819"/>
+            <w:vAlign w:val="center"/>
+            <w:tcBorders>
+              <w:top w:val="single" w:sz="6" w:color="000000"/>
+              <w:left w:val="single" w:sz="6" w:color="000000"/>
+              <w:bottom w:val="single" w:sz="6" w:color="000000"/>
+              <w:right w:val="single" w:sz="6" w:color="000000"/>
+            </w:tcBorders>
+          </w:tcPr>
+          <w:p>
+            <w:pPr>
+              <w:spacing w:before="0" w:after="0" w:line="240" w:lineRule="auto"/>
+              <w:jc w:val="center"/>
+            </w:pPr>
+            <w:r>
+              <w:rPr>
+                <w:rFonts w:ascii="Noto Serif CJK KR" w:hAnsi="Noto Serif CJK KR" w:eastAsia="Noto Serif CJK KR"/>
+                <w:b/>
+                <w:sz w:val="26"/>
+              </w:rPr>
+              <w:t>담당교수</w:t>
+            </w:r>
+          </w:p>
+        </w:tc>
+        <w:tc>
+          <w:tcPr>
+            <w:tcW w:type="dxa" w:w="4819"/>
+            <w:vAlign w:val="center"/>
+            <w:tcBorders>
+              <w:top w:val="single" w:sz="6" w:color="000000"/>
+              <w:left w:val="single" w:sz="6" w:color="000000"/>
+              <w:bottom w:val="single" w:sz="6" w:color="000000"/>
+              <w:right w:val="single" w:sz="6" w:color="000000"/>
+            </w:tcBorders>
+          </w:tcPr>
+          <w:p>
+            <w:pPr>
+              <w:spacing w:before="0" w:after="0" w:line="240" w:lineRule="auto"/>
+              <w:jc w:val="center"/>
+            </w:pPr>
+            <w:r>
+              <w:rPr>
+                <w:rFonts w:ascii="Noto Serif CJK KR" w:hAnsi="Noto Serif CJK KR" w:eastAsia="Noto Serif CJK KR"/>
+                <w:b w:val="0"/>
+                <w:sz w:val="26"/>
+              </w:rPr>
+              <w:t>이재혁 교수님</w:t>
+            </w:r>
+          </w:p>
+        </w:tc>
+      </w:tr>
+      <w:tr>
+        <w:trPr>
+          <w:trHeight w:val="680"/>
+        </w:trPr>
+        <w:tc>
+          <w:tcPr>
+            <w:tcW w:type="dxa" w:w="4819"/>
+            <w:vAlign w:val="center"/>
+            <w:tcBorders>
+              <w:top w:val="single" w:sz="6" w:color="000000"/>
+              <w:left w:val="single" w:sz="6" w:color="000000"/>
+              <w:bottom w:val="single" w:sz="6" w:color="000000"/>
+              <w:right w:val="single" w:sz="6" w:color="000000"/>
+            </w:tcBorders>
+          </w:tcPr>
+          <w:p>
+            <w:pPr>
+              <w:spacing w:before="0" w:after="0" w:line="240" w:lineRule="auto"/>
+              <w:jc w:val="center"/>
+            </w:pPr>
+            <w:r>
+              <w:rPr>
+                <w:rFonts w:ascii="Noto Serif CJK KR" w:hAnsi="Noto Serif CJK KR" w:eastAsia="Noto Serif CJK KR"/>
+                <w:b/>
+                <w:sz w:val="26"/>
+              </w:rPr>
+              <w:t>제출일자</w:t>
+            </w:r>
+          </w:p>
+        </w:tc>
+        <w:tc>
+          <w:tcPr>
+            <w:tcW w:type="dxa" w:w="4819"/>
+            <w:vAlign w:val="center"/>
+            <w:tcBorders>
+              <w:top w:val="single" w:sz="6" w:color="000000"/>
+              <w:left w:val="single" w:sz="6" w:color="000000"/>
+              <w:bottom w:val="single" w:sz="6" w:color="000000"/>
+              <w:right w:val="single" w:sz="6" w:color="000000"/>
+            </w:tcBorders>
+          </w:tcPr>
+          <w:p>
+            <w:pPr>
+              <w:spacing w:before="0" w:after="0" w:line="240" w:lineRule="auto"/>
+              <w:jc w:val="center"/>
+            </w:pPr>
+            <w:r>
+              <w:rPr>
+                <w:rFonts w:ascii="Noto Serif CJK KR" w:hAnsi="Noto Serif CJK KR" w:eastAsia="Noto Serif CJK KR"/>
+                <w:b w:val="0"/>
+                <w:sz w:val="26"/>
+              </w:rPr>
+              <w:t>2026년 ____월 ____일</w:t>
+            </w:r>
+          </w:p>
+        </w:tc>
+      </w:tr>
+      <w:tr>
+        <w:trPr>
+          <w:trHeight w:val="680"/>
+        </w:trPr>
+        <w:tc>
+          <w:tcPr>
+            <w:tcW w:type="dxa" w:w="4819"/>
+            <w:vAlign w:val="center"/>
+            <w:tcBorders>
+              <w:top w:val="single" w:sz="6" w:color="000000"/>
+              <w:left w:val="single" w:sz="6" w:color="000000"/>
+              <w:bottom w:val="single" w:sz="6" w:color="000000"/>
+              <w:right w:val="single" w:sz="6" w:color="000000"/>
+            </w:tcBorders>
+          </w:tcPr>
+          <w:p>
+            <w:pPr>
+              <w:spacing w:before="0" w:after="0" w:line="240" w:lineRule="auto"/>
+              <w:jc w:val="center"/>
+            </w:pPr>
+            <w:r>
+              <w:rPr>
+                <w:rFonts w:ascii="Noto Serif CJK KR" w:hAnsi="Noto Serif CJK KR" w:eastAsia="Noto Serif CJK KR"/>
+                <w:b/>
+                <w:sz w:val="26"/>
+              </w:rPr>
+              <w:t>학 번</w:t>
+            </w:r>
+          </w:p>
+        </w:tc>
+        <w:tc>
+          <w:tcPr>
+            <w:tcW w:type="dxa" w:w="4819"/>
+            <w:vAlign w:val="center"/>
+            <w:tcBorders>
+              <w:top w:val="single" w:sz="6" w:color="000000"/>
+              <w:left w:val="single" w:sz="6" w:color="000000"/>
+              <w:bottom w:val="single" w:sz="6" w:color="000000"/>
+              <w:right w:val="single" w:sz="6" w:color="000000"/>
+            </w:tcBorders>
+          </w:tcPr>
+          <w:p>
+            <w:pPr>
+              <w:spacing w:before="0" w:after="0" w:line="240" w:lineRule="auto"/>
+              <w:jc w:val="center"/>
+            </w:pPr>
+            <w:r>
+              <w:rPr>
+                <w:rFonts w:ascii="Noto Serif CJK KR" w:hAnsi="Noto Serif CJK KR" w:eastAsia="Noto Serif CJK KR"/>
+                <w:b w:val="0"/>
+                <w:sz w:val="26"/>
+              </w:rPr>
+              <w:t>________________</w:t>
+            </w:r>
+          </w:p>
+        </w:tc>
+      </w:tr>
+      <w:tr>
+        <w:trPr>
+          <w:trHeight w:val="680"/>
+        </w:trPr>
+        <w:tc>
+          <w:tcPr>
+            <w:tcW w:type="dxa" w:w="4819"/>
+            <w:vAlign w:val="center"/>
+            <w:tcBorders>
+              <w:top w:val="single" w:sz="6" w:color="000000"/>
+              <w:left w:val="single" w:sz="6" w:color="000000"/>
+              <w:bottom w:val="single" w:sz="6" w:color="000000"/>
+              <w:right w:val="single" w:sz="6" w:color="000000"/>
+            </w:tcBorders>
+          </w:tcPr>
+          <w:p>
+            <w:pPr>
+              <w:spacing w:before="0" w:after="0" w:line="240" w:lineRule="auto"/>
+              <w:jc w:val="center"/>
+            </w:pPr>
+            <w:r>
+              <w:rPr>
+                <w:rFonts w:ascii="Noto Serif CJK KR" w:hAnsi="Noto Serif CJK KR" w:eastAsia="Noto Serif CJK KR"/>
+                <w:b/>
+                <w:sz w:val="26"/>
+              </w:rPr>
+              <w:t>성 명</w:t>
+            </w:r>
+          </w:p>
+        </w:tc>
+        <w:tc>
+          <w:tcPr>
+            <w:tcW w:type="dxa" w:w="4819"/>
+            <w:vAlign w:val="center"/>
+            <w:tcBorders>
+              <w:top w:val="single" w:sz="6" w:color="000000"/>
+              <w:left w:val="single" w:sz="6" w:color="000000"/>
+              <w:bottom w:val="single" w:sz="6" w:color="000000"/>
+              <w:right w:val="single" w:sz="6" w:color="000000"/>
+            </w:tcBorders>
+          </w:tcPr>
+          <w:p>
+            <w:pPr>
+              <w:spacing w:before="0" w:after="0" w:line="240" w:lineRule="auto"/>
+              <w:jc w:val="center"/>
+            </w:pPr>
+            <w:r>
+              <w:rPr>
+                <w:rFonts w:ascii="Noto Serif CJK KR" w:hAnsi="Noto Serif CJK KR" w:eastAsia="Noto Serif CJK KR"/>
+                <w:b w:val="0"/>
+                <w:sz w:val="26"/>
+              </w:rPr>
+              <w:t>________________</w:t>
+            </w:r>
+          </w:p>
+        </w:tc>
+      </w:tr>
+    </w:tbl>
+    <w:p>
+      <w:pPr>
+        <w:spacing w:before="500" w:after="0" w:line="240" w:lineRule="auto"/>
+        <w:jc w:val="center"/>
+      </w:pPr>
+      <w:r>
+        <w:rPr>
+          <w:rFonts w:ascii="Noto Serif CJK KR" w:hAnsi="Noto Serif CJK KR" w:eastAsia="Noto Serif CJK KR"/>
+          <w:b/>
+          <w:color w:val="000000"/>
+          <w:sz w:val="34"/>
+        </w:rPr>
+        <w:t>경동대학교 소프트웨어학과</w:t>
+      </w:r>
+    </w:p>
+    <w:p>
+      <w:pPr>
         <w:pStyle w:val="Title"/>
+        <w:pageBreakBefore/>
       </w:pPr>
       <w:r>
         <w:t>KDU 동아리 프로젝트 보고서</w:t>
@@ -2567,9 +2967,11 @@
     </w:p>
     <w:sectPr>
       <w:footerReference w:type="default" r:id="rId9"/>
-      <w:pgSz w:w="12240" w:h="15840"/>
-      <w:pgMar w:top="1008" w:right="1008" w:bottom="936" w:left="1008" w:header="720" w:footer="720" w:gutter="0"/>
+      <w:footerReference w:type="first" r:id="rId17"/>
+      <w:pgSz w:w="11906" w:h="16838"/>
+      <w:pgMar w:top="1134" w:right="1134" w:bottom="1134" w:left="1134" w:header="720" w:footer="720" w:gutter="0"/>
       <w:cols w:space="720"/>
+      <w:titlePg/>
       <w:docGrid w:linePitch="360"/>
     </w:sectPr>
   </w:body>
@@ -2590,6 +2992,17 @@
       <w:t xml:space="preserve">KDU 동아리 | </w:t>
     </w:r>
     <w:fldSimple w:instr="PAGE"/>
+  </w:p>
+</w:ftr>
+</file>
+
+<file path=word/footer2.xml><?xml version="1.0" encoding="utf-8"?>
+<w:ftr xmlns:m="http://schemas.openxmlformats.org/officeDocument/2006/math" xmlns:mc="http://schemas.openxmlformats.org/markup-compatibility/2006" xmlns:mo="http://schemas.microsoft.com/office/mac/office/2008/main" xmlns:mv="urn:schemas-microsoft-com:mac:vml" xmlns:o="urn:schemas-microsoft-com:office:office" xmlns:r="http://schemas.openxmlformats.org/officeDocument/2006/relationships" xmlns:v="urn:schemas-microsoft-com:vml" xmlns:w10="urn:schemas-microsoft-com:office:word" xmlns:w14="http://schemas.microsoft.com/office/word/2010/wordml" xmlns:w="http://schemas.openxmlformats.org/wordprocessingml/2006/main" xmlns:wne="http://schemas.microsoft.com/office/word/2006/wordml" xmlns:wp14="http://schemas.microsoft.com/office/word/2010/wordprocessingDrawing" xmlns:wp="http://schemas.openxmlformats.org/drawingml/2006/wordprocessingDrawing" xmlns:wpc="http://schemas.microsoft.com/office/word/2010/wordprocessingCanvas" xmlns:wpg="http://schemas.microsoft.com/office/word/2010/wordprocessingGroup" xmlns:wpi="http://schemas.microsoft.com/office/word/2010/wordprocessingInk" xmlns:wps="http://schemas.microsoft.com/office/word/2010/wordprocessingShape" mc:Ignorable="w14 wp14">
+  <w:p>
+    <w:pPr>
+      <w:pStyle w:val="Footer"/>
+    </w:pPr>
+    <w:r/>
   </w:p>
 </w:ftr>
 </file>

</xml_diff>